<commit_message>
changes in kt and readme
</commit_message>
<xml_diff>
--- a/KT/GitHub Actions CI-CD KT Document.docx
+++ b/KT/GitHub Actions CI-CD KT Document.docx
@@ -5116,7 +5116,7 @@
           <w:i/>
           <w:iCs/>
         </w:rPr>
-        <w:t>Figure 8: AWS IAM role summary showing the deployment role and its ARN.</w:t>
+        <w:t xml:space="preserve">Figure 8: AWS IAM role summary </w:t>
       </w:r>
     </w:p>
     <w:p>
@@ -5544,206 +5544,525 @@
     </w:p>
     <w:p>
       <w:pPr>
-        <w:rPr>
-          <w:b/>
-          <w:bCs/>
-        </w:rPr>
-      </w:pPr>
-      <w:r>
-        <w:rPr>
-          <w:b/>
-          <w:bCs/>
-        </w:rPr>
-        <w:t>12.3 OIDC Authentication Flow</w:t>
-      </w:r>
-    </w:p>
-    <w:p>
-      <w:pPr>
+        <w:jc w:val="both"/>
+      </w:pPr>
+      <w:r>
+        <w:drawing>
+          <wp:inline distT="0" distB="0" distL="0" distR="0" wp14:anchorId="1BE52005" wp14:editId="69B02CB6">
+            <wp:extent cx="5731510" cy="2797810"/>
+            <wp:effectExtent l="0" t="0" r="2540" b="2540"/>
+            <wp:docPr id="2006106196" name="Picture 1"/>
+            <wp:cNvGraphicFramePr>
+              <a:graphicFrameLocks xmlns:a="http://schemas.openxmlformats.org/drawingml/2006/main" noChangeAspect="1"/>
+            </wp:cNvGraphicFramePr>
+            <a:graphic xmlns:a="http://schemas.openxmlformats.org/drawingml/2006/main">
+              <a:graphicData uri="http://schemas.openxmlformats.org/drawingml/2006/picture">
+                <pic:pic xmlns:pic="http://schemas.openxmlformats.org/drawingml/2006/picture">
+                  <pic:nvPicPr>
+                    <pic:cNvPr id="2006106196" name=""/>
+                    <pic:cNvPicPr/>
+                  </pic:nvPicPr>
+                  <pic:blipFill>
+                    <a:blip r:embed="rId15"/>
+                    <a:stretch>
+                      <a:fillRect/>
+                    </a:stretch>
+                  </pic:blipFill>
+                  <pic:spPr>
+                    <a:xfrm>
+                      <a:off x="0" y="0"/>
+                      <a:ext cx="5731510" cy="2797810"/>
+                    </a:xfrm>
+                    <a:prstGeom prst="rect">
+                      <a:avLst/>
+                    </a:prstGeom>
+                  </pic:spPr>
+                </pic:pic>
+              </a:graphicData>
+            </a:graphic>
+          </wp:inline>
+        </w:drawing>
+      </w:r>
+    </w:p>
+    <w:p>
+      <w:pPr>
+        <w:jc w:val="center"/>
+      </w:pPr>
+      <w:r>
+        <w:rPr>
+          <w:i/>
+          <w:iCs/>
+        </w:rPr>
+        <w:t xml:space="preserve">Figure 9: </w:t>
+      </w:r>
+      <w:r>
+        <w:rPr>
+          <w:i/>
+          <w:iCs/>
+        </w:rPr>
+        <w:t>GitHub OIDC Identity Provider</w:t>
+      </w:r>
+      <w:r>
+        <w:rPr>
+          <w:i/>
+          <w:iCs/>
+        </w:rPr>
+        <w:t xml:space="preserve"> Summary</w:t>
+      </w:r>
+    </w:p>
+    <w:p>
+      <w:pPr>
+        <w:jc w:val="both"/>
+      </w:pPr>
+      <w:r>
+        <w:t xml:space="preserve">Once the provider is created, the </w:t>
+      </w:r>
+      <w:r>
+        <w:t xml:space="preserve">GitHub OIDC provider ARN </w:t>
+      </w:r>
+      <w:r>
+        <w:t xml:space="preserve">is used </w:t>
+      </w:r>
+      <w:r>
+        <w:t>as the federated principal</w:t>
+      </w:r>
+      <w:r>
+        <w:t xml:space="preserve"> for </w:t>
+      </w:r>
+      <w:r>
+        <w:t>trust policy</w:t>
+      </w:r>
+      <w:r>
+        <w:t xml:space="preserve"> configuration.</w:t>
+      </w:r>
+    </w:p>
+    <w:p>
+      <w:pPr>
+        <w:rPr>
+          <w:b/>
+          <w:bCs/>
+        </w:rPr>
+      </w:pPr>
+      <w:r>
+        <w:rPr>
+          <w:b/>
+          <w:bCs/>
+        </w:rPr>
+        <w:t xml:space="preserve">12.4 Trust Policy </w:t>
+      </w:r>
+    </w:p>
+    <w:p>
+      <w:pPr>
+        <w:jc w:val="both"/>
+      </w:pPr>
+      <w:r>
+        <w:t>The IAM role trust policy determines which identity can assume the role. It does not define the S3 permissions granted after assumption; those permissions are controlled by the role's permissions policy.</w:t>
+      </w:r>
+      <w:r>
+        <w:t xml:space="preserve"> </w:t>
+      </w:r>
+      <w:r>
+        <w:t>The trust policy should be restricted to the intended repository and branch as supported by the actual GitHub OIDC claims and AWS configuration.</w:t>
+      </w:r>
+    </w:p>
+    <w:p>
+      <w:pPr>
+        <w:pStyle w:val="NormalWeb"/>
+        <w:rPr>
+          <w:rFonts w:asciiTheme="minorHAnsi" w:hAnsiTheme="minorHAnsi" w:cstheme="minorHAnsi"/>
+        </w:rPr>
+      </w:pPr>
+      <w:r>
+        <w:rPr>
+          <w:rFonts w:asciiTheme="minorHAnsi" w:hAnsiTheme="minorHAnsi" w:cstheme="minorHAnsi"/>
+        </w:rPr>
+        <w:lastRenderedPageBreak/>
+        <w:t>The IAM role used for deployment is:</w:t>
+      </w:r>
+    </w:p>
+    <w:p>
+      <w:pPr>
+        <w:pStyle w:val="NormalWeb"/>
         <w:numPr>
           <w:ilvl w:val="0"/>
-          <w:numId w:val="17"/>
+          <w:numId w:val="37"/>
         </w:numPr>
-      </w:pPr>
-      <w:r>
-        <w:t>A workflow run starts in GitHub Actions.</w:t>
-      </w:r>
-    </w:p>
-    <w:p>
-      <w:pPr>
+        <w:rPr>
+          <w:rFonts w:asciiTheme="minorHAnsi" w:hAnsiTheme="minorHAnsi" w:cstheme="minorHAnsi"/>
+        </w:rPr>
+      </w:pPr>
+      <w:r>
+        <w:rPr>
+          <w:rStyle w:val="Strong"/>
+          <w:rFonts w:asciiTheme="minorHAnsi" w:hAnsiTheme="minorHAnsi" w:cstheme="minorHAnsi"/>
+        </w:rPr>
+        <w:t>Role name:</w:t>
+      </w:r>
+      <w:r>
+        <w:rPr>
+          <w:rFonts w:asciiTheme="minorHAnsi" w:hAnsiTheme="minorHAnsi" w:cstheme="minorHAnsi"/>
+        </w:rPr>
+        <w:t xml:space="preserve"> </w:t>
+      </w:r>
+      <w:r>
+        <w:rPr>
+          <w:rStyle w:val="HTMLCode"/>
+          <w:rFonts w:asciiTheme="minorHAnsi" w:hAnsiTheme="minorHAnsi" w:cstheme="minorHAnsi"/>
+          <w:sz w:val="24"/>
+          <w:szCs w:val="24"/>
+        </w:rPr>
+        <w:t>GitHubActions-Sandeep-S3-Deploy</w:t>
+      </w:r>
+    </w:p>
+    <w:p>
+      <w:pPr>
+        <w:pStyle w:val="NormalWeb"/>
         <w:numPr>
           <w:ilvl w:val="0"/>
-          <w:numId w:val="17"/>
+          <w:numId w:val="37"/>
         </w:numPr>
-      </w:pPr>
-      <w:r>
-        <w:t>The workflow has id-token: write permission.</w:t>
-      </w:r>
-    </w:p>
-    <w:p>
-      <w:pPr>
+        <w:rPr>
+          <w:rFonts w:asciiTheme="minorHAnsi" w:hAnsiTheme="minorHAnsi" w:cstheme="minorHAnsi"/>
+        </w:rPr>
+      </w:pPr>
+      <w:r>
+        <w:rPr>
+          <w:rStyle w:val="Strong"/>
+          <w:rFonts w:asciiTheme="minorHAnsi" w:hAnsiTheme="minorHAnsi" w:cstheme="minorHAnsi"/>
+        </w:rPr>
+        <w:t>Role ARN:</w:t>
+      </w:r>
+      <w:r>
+        <w:rPr>
+          <w:rFonts w:asciiTheme="minorHAnsi" w:hAnsiTheme="minorHAnsi" w:cstheme="minorHAnsi"/>
+        </w:rPr>
+        <w:t xml:space="preserve"> </w:t>
+      </w:r>
+      <w:proofErr w:type="spellStart"/>
+      <w:proofErr w:type="gramStart"/>
+      <w:r>
+        <w:rPr>
+          <w:rStyle w:val="HTMLCode"/>
+          <w:rFonts w:asciiTheme="minorHAnsi" w:hAnsiTheme="minorHAnsi" w:cstheme="minorHAnsi"/>
+          <w:sz w:val="24"/>
+          <w:szCs w:val="24"/>
+        </w:rPr>
+        <w:t>arn:aws</w:t>
+      </w:r>
+      <w:proofErr w:type="gramEnd"/>
+      <w:r>
+        <w:rPr>
+          <w:rStyle w:val="HTMLCode"/>
+          <w:rFonts w:asciiTheme="minorHAnsi" w:hAnsiTheme="minorHAnsi" w:cstheme="minorHAnsi"/>
+          <w:sz w:val="24"/>
+          <w:szCs w:val="24"/>
+        </w:rPr>
+        <w:t>:</w:t>
+      </w:r>
+      <w:proofErr w:type="gramStart"/>
+      <w:r>
+        <w:rPr>
+          <w:rStyle w:val="HTMLCode"/>
+          <w:rFonts w:asciiTheme="minorHAnsi" w:hAnsiTheme="minorHAnsi" w:cstheme="minorHAnsi"/>
+          <w:sz w:val="24"/>
+          <w:szCs w:val="24"/>
+        </w:rPr>
+        <w:t>iam</w:t>
+      </w:r>
+      <w:proofErr w:type="spellEnd"/>
+      <w:r>
+        <w:rPr>
+          <w:rStyle w:val="HTMLCode"/>
+          <w:rFonts w:asciiTheme="minorHAnsi" w:hAnsiTheme="minorHAnsi" w:cstheme="minorHAnsi"/>
+          <w:sz w:val="24"/>
+          <w:szCs w:val="24"/>
+        </w:rPr>
+        <w:t>::767260371307:role</w:t>
+      </w:r>
+      <w:proofErr w:type="gramEnd"/>
+      <w:r>
+        <w:rPr>
+          <w:rStyle w:val="HTMLCode"/>
+          <w:rFonts w:asciiTheme="minorHAnsi" w:hAnsiTheme="minorHAnsi" w:cstheme="minorHAnsi"/>
+          <w:sz w:val="24"/>
+          <w:szCs w:val="24"/>
+        </w:rPr>
+        <w:t>/GitHubActions-Sandeep-S3-Deploy</w:t>
+      </w:r>
+    </w:p>
+    <w:p>
+      <w:pPr>
+        <w:pStyle w:val="NormalWeb"/>
+        <w:rPr>
+          <w:rFonts w:asciiTheme="minorHAnsi" w:hAnsiTheme="minorHAnsi" w:cstheme="minorHAnsi"/>
+        </w:rPr>
+      </w:pPr>
+      <w:r>
+        <w:rPr>
+          <w:rStyle w:val="Strong"/>
+          <w:rFonts w:asciiTheme="minorHAnsi" w:hAnsiTheme="minorHAnsi" w:cstheme="minorHAnsi"/>
+        </w:rPr>
+        <w:t>Steps to configure the trust policy</w:t>
+      </w:r>
+    </w:p>
+    <w:p>
+      <w:pPr>
+        <w:pStyle w:val="NormalWeb"/>
         <w:numPr>
           <w:ilvl w:val="0"/>
-          <w:numId w:val="17"/>
+          <w:numId w:val="38"/>
         </w:numPr>
-      </w:pPr>
-      <w:r>
-        <w:t>GitHub issues an OIDC token for the workflow.</w:t>
-      </w:r>
-    </w:p>
-    <w:p>
-      <w:pPr>
+        <w:spacing w:line="276" w:lineRule="auto"/>
+        <w:rPr>
+          <w:rFonts w:asciiTheme="minorHAnsi" w:hAnsiTheme="minorHAnsi" w:cstheme="minorHAnsi"/>
+        </w:rPr>
+      </w:pPr>
+      <w:r>
+        <w:rPr>
+          <w:rFonts w:asciiTheme="minorHAnsi" w:hAnsiTheme="minorHAnsi" w:cstheme="minorHAnsi"/>
+        </w:rPr>
+        <w:t xml:space="preserve">Open </w:t>
+      </w:r>
+      <w:r>
+        <w:rPr>
+          <w:rStyle w:val="Strong"/>
+          <w:rFonts w:asciiTheme="minorHAnsi" w:hAnsiTheme="minorHAnsi" w:cstheme="minorHAnsi"/>
+        </w:rPr>
+        <w:t>AWS IAM → Roles</w:t>
+      </w:r>
+      <w:r>
+        <w:rPr>
+          <w:rFonts w:asciiTheme="minorHAnsi" w:hAnsiTheme="minorHAnsi" w:cstheme="minorHAnsi"/>
+        </w:rPr>
+        <w:t>.</w:t>
+      </w:r>
+    </w:p>
+    <w:p>
+      <w:pPr>
+        <w:pStyle w:val="NormalWeb"/>
         <w:numPr>
           <w:ilvl w:val="0"/>
-          <w:numId w:val="17"/>
+          <w:numId w:val="38"/>
         </w:numPr>
-      </w:pPr>
-      <w:r>
-        <w:t>The AWS credentials action sends a role-assumption request to AWS STS.</w:t>
-      </w:r>
-    </w:p>
-    <w:p>
-      <w:pPr>
+        <w:spacing w:line="276" w:lineRule="auto"/>
+        <w:rPr>
+          <w:rFonts w:asciiTheme="minorHAnsi" w:hAnsiTheme="minorHAnsi" w:cstheme="minorHAnsi"/>
+        </w:rPr>
+      </w:pPr>
+      <w:r>
+        <w:rPr>
+          <w:rFonts w:asciiTheme="minorHAnsi" w:hAnsiTheme="minorHAnsi" w:cstheme="minorHAnsi"/>
+        </w:rPr>
+        <w:t xml:space="preserve">Select </w:t>
+      </w:r>
+      <w:r>
+        <w:rPr>
+          <w:rStyle w:val="HTMLCode"/>
+          <w:rFonts w:asciiTheme="minorHAnsi" w:hAnsiTheme="minorHAnsi" w:cstheme="minorHAnsi"/>
+          <w:sz w:val="24"/>
+          <w:szCs w:val="24"/>
+        </w:rPr>
+        <w:t>GitHubActions-Sandeep-S3-Deploy</w:t>
+      </w:r>
+      <w:r>
+        <w:rPr>
+          <w:rFonts w:asciiTheme="minorHAnsi" w:hAnsiTheme="minorHAnsi" w:cstheme="minorHAnsi"/>
+        </w:rPr>
+        <w:t>.</w:t>
+      </w:r>
+    </w:p>
+    <w:p>
+      <w:pPr>
+        <w:pStyle w:val="NormalWeb"/>
         <w:numPr>
           <w:ilvl w:val="0"/>
-          <w:numId w:val="17"/>
+          <w:numId w:val="38"/>
         </w:numPr>
-      </w:pPr>
-      <w:r>
-        <w:t>AWS validates the token and evaluates the role trust policy.</w:t>
-      </w:r>
-    </w:p>
-    <w:p>
-      <w:pPr>
+        <w:spacing w:line="276" w:lineRule="auto"/>
+        <w:rPr>
+          <w:rFonts w:asciiTheme="minorHAnsi" w:hAnsiTheme="minorHAnsi" w:cstheme="minorHAnsi"/>
+        </w:rPr>
+      </w:pPr>
+      <w:r>
+        <w:rPr>
+          <w:rFonts w:asciiTheme="minorHAnsi" w:hAnsiTheme="minorHAnsi" w:cstheme="minorHAnsi"/>
+        </w:rPr>
+        <w:t xml:space="preserve">Open the </w:t>
+      </w:r>
+      <w:r>
+        <w:rPr>
+          <w:rStyle w:val="Strong"/>
+          <w:rFonts w:asciiTheme="minorHAnsi" w:hAnsiTheme="minorHAnsi" w:cstheme="minorHAnsi"/>
+        </w:rPr>
+        <w:t>Trust relationships</w:t>
+      </w:r>
+      <w:r>
+        <w:rPr>
+          <w:rFonts w:asciiTheme="minorHAnsi" w:hAnsiTheme="minorHAnsi" w:cstheme="minorHAnsi"/>
+        </w:rPr>
+        <w:t xml:space="preserve"> tab.</w:t>
+      </w:r>
+    </w:p>
+    <w:p>
+      <w:pPr>
+        <w:pStyle w:val="NormalWeb"/>
         <w:numPr>
           <w:ilvl w:val="0"/>
-          <w:numId w:val="17"/>
+          <w:numId w:val="38"/>
         </w:numPr>
-      </w:pPr>
-      <w:r>
-        <w:t>AWS STS returns temporary credentials if the request is authorized.</w:t>
-      </w:r>
-    </w:p>
-    <w:p>
-      <w:pPr>
+        <w:spacing w:line="276" w:lineRule="auto"/>
+        <w:rPr>
+          <w:rFonts w:asciiTheme="minorHAnsi" w:hAnsiTheme="minorHAnsi" w:cstheme="minorHAnsi"/>
+        </w:rPr>
+      </w:pPr>
+      <w:r>
+        <w:rPr>
+          <w:rFonts w:asciiTheme="minorHAnsi" w:hAnsiTheme="minorHAnsi" w:cstheme="minorHAnsi"/>
+        </w:rPr>
+        <w:t xml:space="preserve">Select </w:t>
+      </w:r>
+      <w:r>
+        <w:rPr>
+          <w:rStyle w:val="Strong"/>
+          <w:rFonts w:asciiTheme="minorHAnsi" w:hAnsiTheme="minorHAnsi" w:cstheme="minorHAnsi"/>
+        </w:rPr>
+        <w:t>Edit trust policy</w:t>
+      </w:r>
+      <w:r>
+        <w:rPr>
+          <w:rFonts w:asciiTheme="minorHAnsi" w:hAnsiTheme="minorHAnsi" w:cstheme="minorHAnsi"/>
+        </w:rPr>
+        <w:t>.</w:t>
+      </w:r>
+    </w:p>
+    <w:p>
+      <w:pPr>
+        <w:pStyle w:val="NormalWeb"/>
         <w:numPr>
           <w:ilvl w:val="0"/>
-          <w:numId w:val="17"/>
+          <w:numId w:val="38"/>
         </w:numPr>
-      </w:pPr>
-      <w:r>
-        <w:t>The AWS CLI uses the temporary credentials to verify the identity and deploy the files.</w:t>
-      </w:r>
-    </w:p>
-    <w:p>
-      <w:pPr>
-        <w:rPr>
-          <w:b/>
-          <w:bCs/>
-        </w:rPr>
-      </w:pPr>
-      <w:r>
-        <w:rPr>
-          <w:b/>
-          <w:bCs/>
-        </w:rPr>
-        <w:t>12.4 Trust Policy Purpose</w:t>
-      </w:r>
-    </w:p>
-    <w:p>
-      <w:pPr>
-        <w:jc w:val="both"/>
-      </w:pPr>
-      <w:r>
-        <w:t>The IAM role trust policy determines which identity can assume the role. It does not define the S3 permissions granted after assumption; those permissions are controlled by the role's permissions policy.</w:t>
-      </w:r>
-      <w:r>
-        <w:t xml:space="preserve"> </w:t>
-      </w:r>
-      <w:r>
-        <w:t>The trust policy should be restricted to the intended repository and branch as supported by the actual GitHub OIDC claims and AWS configuration.</w:t>
-      </w:r>
-    </w:p>
-    <w:p>
-      <w:pPr>
-        <w:rPr>
-          <w:b/>
-          <w:bCs/>
-        </w:rPr>
-      </w:pPr>
-      <w:r>
-        <w:rPr>
-          <w:b/>
-          <w:bCs/>
-        </w:rPr>
-        <w:t>12.5 Trust Policy JSON</w:t>
-      </w:r>
-    </w:p>
-    <w:p>
-      <w:r>
-        <w:t>Insert the exact working trust policy from AWS IAM in this section.</w:t>
-      </w:r>
-    </w:p>
-    <w:p>
-      <w:r>
-        <w:t>A trust policy normally contains a statement that:</w:t>
-      </w:r>
-    </w:p>
-    <w:p>
-      <w:pPr>
+        <w:spacing w:line="276" w:lineRule="auto"/>
+        <w:rPr>
+          <w:rFonts w:asciiTheme="minorHAnsi" w:hAnsiTheme="minorHAnsi" w:cstheme="minorHAnsi"/>
+        </w:rPr>
+      </w:pPr>
+      <w:r>
+        <w:rPr>
+          <w:rFonts w:asciiTheme="minorHAnsi" w:hAnsiTheme="minorHAnsi" w:cstheme="minorHAnsi"/>
+        </w:rPr>
+        <w:t xml:space="preserve">Configure the </w:t>
+      </w:r>
+      <w:r>
+        <w:rPr>
+          <w:rFonts w:asciiTheme="minorHAnsi" w:hAnsiTheme="minorHAnsi" w:cstheme="minorHAnsi"/>
+          <w:b/>
+          <w:bCs/>
+        </w:rPr>
+        <w:t>GitHub OIDC provider ARN</w:t>
+      </w:r>
+      <w:r>
+        <w:rPr>
+          <w:rFonts w:asciiTheme="minorHAnsi" w:hAnsiTheme="minorHAnsi" w:cstheme="minorHAnsi"/>
+        </w:rPr>
+        <w:t xml:space="preserve"> as the federated principal.</w:t>
+      </w:r>
+    </w:p>
+    <w:p>
+      <w:pPr>
+        <w:pStyle w:val="NormalWeb"/>
         <w:numPr>
           <w:ilvl w:val="0"/>
-          <w:numId w:val="18"/>
+          <w:numId w:val="38"/>
         </w:numPr>
-      </w:pPr>
-      <w:r>
-        <w:t>Allows the federated principal associated with the GitHub OIDC provider.</w:t>
-      </w:r>
-    </w:p>
-    <w:p>
-      <w:pPr>
+        <w:spacing w:line="276" w:lineRule="auto"/>
+        <w:rPr>
+          <w:rFonts w:asciiTheme="minorHAnsi" w:hAnsiTheme="minorHAnsi" w:cstheme="minorHAnsi"/>
+        </w:rPr>
+      </w:pPr>
+      <w:r>
+        <w:rPr>
+          <w:rFonts w:asciiTheme="minorHAnsi" w:hAnsiTheme="minorHAnsi" w:cstheme="minorHAnsi"/>
+        </w:rPr>
+        <w:t xml:space="preserve">Set the action to </w:t>
+      </w:r>
+      <w:proofErr w:type="spellStart"/>
+      <w:proofErr w:type="gramStart"/>
+      <w:r>
+        <w:rPr>
+          <w:rStyle w:val="HTMLCode"/>
+          <w:rFonts w:asciiTheme="minorHAnsi" w:hAnsiTheme="minorHAnsi" w:cstheme="minorHAnsi"/>
+          <w:b/>
+          <w:bCs/>
+          <w:sz w:val="24"/>
+          <w:szCs w:val="24"/>
+        </w:rPr>
+        <w:t>sts:AssumeRoleWithWebIdentity</w:t>
+      </w:r>
+      <w:proofErr w:type="spellEnd"/>
+      <w:proofErr w:type="gramEnd"/>
+      <w:r>
+        <w:rPr>
+          <w:rFonts w:asciiTheme="minorHAnsi" w:hAnsiTheme="minorHAnsi" w:cstheme="minorHAnsi"/>
+          <w:b/>
+          <w:bCs/>
+        </w:rPr>
+        <w:t>.</w:t>
+      </w:r>
+    </w:p>
+    <w:p>
+      <w:pPr>
+        <w:pStyle w:val="NormalWeb"/>
         <w:numPr>
           <w:ilvl w:val="0"/>
-          <w:numId w:val="18"/>
+          <w:numId w:val="38"/>
         </w:numPr>
-      </w:pPr>
-      <w:r>
-        <w:lastRenderedPageBreak/>
-        <w:t xml:space="preserve">Uses the AWS STS </w:t>
-      </w:r>
-      <w:proofErr w:type="spellStart"/>
-      <w:r>
-        <w:t>AssumeRoleWithWebIdentity</w:t>
-      </w:r>
-      <w:proofErr w:type="spellEnd"/>
-      <w:r>
-        <w:t xml:space="preserve"> action.</w:t>
-      </w:r>
-    </w:p>
-    <w:p>
-      <w:pPr>
+        <w:spacing w:line="276" w:lineRule="auto"/>
+        <w:rPr>
+          <w:rFonts w:asciiTheme="minorHAnsi" w:hAnsiTheme="minorHAnsi" w:cstheme="minorHAnsi"/>
+        </w:rPr>
+      </w:pPr>
+      <w:r>
+        <w:rPr>
+          <w:rFonts w:asciiTheme="minorHAnsi" w:hAnsiTheme="minorHAnsi" w:cstheme="minorHAnsi"/>
+        </w:rPr>
+        <w:t xml:space="preserve">Add conditions restricting the token audience to </w:t>
+      </w:r>
+      <w:r>
+        <w:rPr>
+          <w:rStyle w:val="HTMLCode"/>
+          <w:rFonts w:asciiTheme="minorHAnsi" w:hAnsiTheme="minorHAnsi" w:cstheme="minorHAnsi"/>
+          <w:b/>
+          <w:bCs/>
+          <w:sz w:val="24"/>
+          <w:szCs w:val="24"/>
+        </w:rPr>
+        <w:t>sts.amazonaws.com</w:t>
+      </w:r>
+      <w:r>
+        <w:rPr>
+          <w:rFonts w:asciiTheme="minorHAnsi" w:hAnsiTheme="minorHAnsi" w:cstheme="minorHAnsi"/>
+        </w:rPr>
+        <w:t xml:space="preserve"> and the subject to the intended GitHub repository and branch.</w:t>
+      </w:r>
+    </w:p>
+    <w:p>
+      <w:pPr>
+        <w:pStyle w:val="NormalWeb"/>
         <w:numPr>
           <w:ilvl w:val="0"/>
-          <w:numId w:val="18"/>
+          <w:numId w:val="38"/>
         </w:numPr>
-      </w:pPr>
-      <w:r>
-        <w:t>Restricts the audience to sts.amazonaws.com.</w:t>
-      </w:r>
-    </w:p>
-    <w:p>
-      <w:pPr>
-        <w:numPr>
-          <w:ilvl w:val="0"/>
-          <w:numId w:val="18"/>
-        </w:numPr>
-      </w:pPr>
-      <w:r>
-        <w:t>Restricts the subject or equivalent supported claims to the intended GitHub workflow identity.</w:t>
-      </w:r>
-    </w:p>
-    <w:p>
-      <w:r>
-        <w:t>The precise Condition block must match the working configuration in the AWS console.</w:t>
+        <w:spacing w:line="276" w:lineRule="auto"/>
+        <w:rPr>
+          <w:rFonts w:asciiTheme="minorHAnsi" w:hAnsiTheme="minorHAnsi" w:cstheme="minorHAnsi"/>
+        </w:rPr>
+      </w:pPr>
+      <w:r>
+        <w:rPr>
+          <w:rFonts w:asciiTheme="minorHAnsi" w:hAnsiTheme="minorHAnsi" w:cstheme="minorHAnsi"/>
+        </w:rPr>
+        <w:t>Save the policy and verify that the repository and branch restrictions match the actual GitHub OIDC claims.</w:t>
       </w:r>
     </w:p>
     <w:p>
@@ -5776,7 +6095,7 @@
                     <pic:cNvPicPr/>
                   </pic:nvPicPr>
                   <pic:blipFill>
-                    <a:blip r:embed="rId15"/>
+                    <a:blip r:embed="rId16"/>
                     <a:stretch>
                       <a:fillRect/>
                     </a:stretch>
@@ -5806,120 +6125,415 @@
     </w:p>
     <w:p>
       <w:pPr>
-        <w:rPr>
-          <w:b/>
-          <w:bCs/>
-        </w:rPr>
-      </w:pPr>
-      <w:r>
-        <w:rPr>
-          <w:b/>
-          <w:bCs/>
-        </w:rPr>
-        <w:t>12.6 OIDC Verification</w:t>
-      </w:r>
-    </w:p>
-    <w:p>
-      <w:r>
-        <w:t xml:space="preserve">During </w:t>
-      </w:r>
-      <w:r>
-        <w:t>verification</w:t>
-      </w:r>
-      <w:r>
-        <w:t>, the workflow inspected the token's issuer, audience, and subject without printing the token itself.</w:t>
-      </w:r>
-    </w:p>
-    <w:p>
-      <w:pPr>
-        <w:rPr>
-          <w:b/>
-          <w:bCs/>
-        </w:rPr>
-      </w:pPr>
-      <w:r>
-        <w:rPr>
-          <w:b/>
-          <w:bCs/>
-        </w:rPr>
-        <w:t>The output showed:</w:t>
-      </w:r>
-    </w:p>
-    <w:p>
-      <w:pPr>
-        <w:rPr>
-          <w:b/>
-          <w:bCs/>
-        </w:rPr>
-      </w:pPr>
-      <w:r>
-        <w:rPr>
-          <w:b/>
-          <w:bCs/>
-        </w:rPr>
-        <w:t>Issuer:   https://token.actions.githubusercontent.com</w:t>
-      </w:r>
-    </w:p>
-    <w:p>
-      <w:pPr>
-        <w:rPr>
-          <w:b/>
-          <w:bCs/>
-        </w:rPr>
-      </w:pPr>
-      <w:r>
-        <w:rPr>
-          <w:b/>
-          <w:bCs/>
-        </w:rPr>
-        <w:t>Audience: sts.amazonaws.com</w:t>
-      </w:r>
-    </w:p>
-    <w:p>
-      <w:pPr>
-        <w:rPr>
-          <w:b/>
-          <w:bCs/>
-        </w:rPr>
-      </w:pPr>
-      <w:r>
-        <w:rPr>
-          <w:b/>
-          <w:bCs/>
-        </w:rPr>
-        <w:t xml:space="preserve">Subject:  </w:t>
-      </w:r>
+        <w:jc w:val="both"/>
+        <w:rPr>
+          <w:rFonts w:eastAsia="Times New Roman" w:cstheme="minorHAnsi"/>
+          <w:kern w:val="0"/>
+          <w:lang w:eastAsia="en-AE"/>
+          <w14:ligatures w14:val="none"/>
+        </w:rPr>
+      </w:pPr>
+      <w:r>
+        <w:rPr>
+          <w:rFonts w:eastAsia="Times New Roman" w:cstheme="minorHAnsi"/>
+          <w:kern w:val="0"/>
+          <w:lang w:eastAsia="en-AE"/>
+          <w14:ligatures w14:val="none"/>
+        </w:rPr>
+        <w:t xml:space="preserve">The </w:t>
+      </w:r>
+      <w:r>
+        <w:rPr>
+          <w:rFonts w:eastAsia="Times New Roman" w:cstheme="minorHAnsi"/>
+          <w:b/>
+          <w:bCs/>
+          <w:kern w:val="0"/>
+          <w:lang w:eastAsia="en-AE"/>
+          <w14:ligatures w14:val="none"/>
+        </w:rPr>
+        <w:t>sub</w:t>
+      </w:r>
+      <w:r>
+        <w:rPr>
+          <w:rFonts w:eastAsia="Times New Roman" w:cstheme="minorHAnsi"/>
+          <w:kern w:val="0"/>
+          <w:lang w:eastAsia="en-AE"/>
+          <w14:ligatures w14:val="none"/>
+        </w:rPr>
+        <w:t xml:space="preserve"> </w:t>
+      </w:r>
+      <w:r>
+        <w:rPr>
+          <w:rFonts w:eastAsia="Times New Roman" w:cstheme="minorHAnsi"/>
+          <w:b/>
+          <w:bCs/>
+          <w:kern w:val="0"/>
+          <w:lang w:eastAsia="en-AE"/>
+          <w14:ligatures w14:val="none"/>
+        </w:rPr>
+        <w:t>condition</w:t>
+      </w:r>
+      <w:r>
+        <w:rPr>
+          <w:rFonts w:eastAsia="Times New Roman" w:cstheme="minorHAnsi"/>
+          <w:kern w:val="0"/>
+          <w:lang w:eastAsia="en-AE"/>
+          <w14:ligatures w14:val="none"/>
+        </w:rPr>
+        <w:t xml:space="preserve"> restricts role assumption to the specified repository and branch. The </w:t>
+      </w:r>
+      <w:proofErr w:type="spellStart"/>
+      <w:r>
+        <w:rPr>
+          <w:rFonts w:eastAsia="Times New Roman" w:cstheme="minorHAnsi"/>
+          <w:b/>
+          <w:bCs/>
+          <w:kern w:val="0"/>
+          <w:lang w:eastAsia="en-AE"/>
+          <w14:ligatures w14:val="none"/>
+        </w:rPr>
+        <w:t>aud</w:t>
+      </w:r>
+      <w:proofErr w:type="spellEnd"/>
+      <w:r>
+        <w:rPr>
+          <w:rFonts w:eastAsia="Times New Roman" w:cstheme="minorHAnsi"/>
+          <w:kern w:val="0"/>
+          <w:lang w:eastAsia="en-AE"/>
+          <w14:ligatures w14:val="none"/>
+        </w:rPr>
+        <w:t xml:space="preserve"> </w:t>
+      </w:r>
+      <w:r>
+        <w:rPr>
+          <w:rFonts w:eastAsia="Times New Roman" w:cstheme="minorHAnsi"/>
+          <w:b/>
+          <w:bCs/>
+          <w:kern w:val="0"/>
+          <w:lang w:eastAsia="en-AE"/>
+          <w14:ligatures w14:val="none"/>
+        </w:rPr>
+        <w:t>condition</w:t>
+      </w:r>
+      <w:r>
+        <w:rPr>
+          <w:rFonts w:eastAsia="Times New Roman" w:cstheme="minorHAnsi"/>
+          <w:kern w:val="0"/>
+          <w:lang w:eastAsia="en-AE"/>
+          <w14:ligatures w14:val="none"/>
+        </w:rPr>
+        <w:t xml:space="preserve"> ensures that the token is intended for AWS STS. Together, these conditions limit</w:t>
+      </w:r>
+      <w:r>
+        <w:rPr>
+          <w:rFonts w:eastAsia="Times New Roman" w:cstheme="minorHAnsi"/>
+          <w:kern w:val="0"/>
+          <w:lang w:eastAsia="en-AE"/>
+          <w14:ligatures w14:val="none"/>
+        </w:rPr>
+        <w:t xml:space="preserve"> </w:t>
+      </w:r>
+      <w:r>
+        <w:rPr>
+          <w:rFonts w:eastAsia="Times New Roman" w:cstheme="minorHAnsi"/>
+          <w:kern w:val="0"/>
+          <w:lang w:eastAsia="en-AE"/>
+          <w14:ligatures w14:val="none"/>
+        </w:rPr>
+        <w:t>which GitHub Actions workflow identities can assume the deployment role.</w:t>
+      </w:r>
+    </w:p>
+    <w:p>
+      <w:pPr>
+        <w:jc w:val="both"/>
+        <w:rPr>
+          <w:rFonts w:eastAsia="Times New Roman" w:cstheme="minorHAnsi"/>
+          <w:kern w:val="0"/>
+          <w:lang w:eastAsia="en-AE"/>
+          <w14:ligatures w14:val="none"/>
+        </w:rPr>
+      </w:pPr>
+      <w:r>
+        <w:rPr>
+          <w:rFonts w:eastAsia="Times New Roman" w:cstheme="minorHAnsi"/>
+          <w:kern w:val="0"/>
+          <w:lang w:eastAsia="en-AE"/>
+          <w14:ligatures w14:val="none"/>
+        </w:rPr>
+        <w:lastRenderedPageBreak/>
+        <w:t>T</w:t>
+      </w:r>
+      <w:r>
+        <w:rPr>
+          <w:rFonts w:eastAsia="Times New Roman" w:cstheme="minorHAnsi"/>
+          <w:kern w:val="0"/>
+          <w:lang w:eastAsia="en-AE"/>
+          <w14:ligatures w14:val="none"/>
+        </w:rPr>
+        <w:t>he GitHub repository</w:t>
+      </w:r>
+      <w:r>
+        <w:rPr>
+          <w:rFonts w:eastAsia="Times New Roman" w:cstheme="minorHAnsi"/>
+          <w:kern w:val="0"/>
+          <w:lang w:eastAsia="en-AE"/>
+          <w14:ligatures w14:val="none"/>
+        </w:rPr>
+        <w:t xml:space="preserve"> has</w:t>
+      </w:r>
+      <w:r>
+        <w:rPr>
+          <w:rFonts w:eastAsia="Times New Roman" w:cstheme="minorHAnsi"/>
+          <w:kern w:val="0"/>
+          <w:lang w:eastAsia="en-AE"/>
+          <w14:ligatures w14:val="none"/>
+        </w:rPr>
+        <w:t xml:space="preserve"> </w:t>
+      </w:r>
+      <w:r>
+        <w:rPr>
+          <w:rFonts w:eastAsia="Times New Roman" w:cstheme="minorHAnsi"/>
+          <w:kern w:val="0"/>
+          <w:lang w:eastAsia="en-AE"/>
+          <w14:ligatures w14:val="none"/>
+        </w:rPr>
+        <w:t>d</w:t>
+      </w:r>
+      <w:r>
+        <w:rPr>
+          <w:rFonts w:eastAsia="Times New Roman" w:cstheme="minorHAnsi"/>
+          <w:kern w:val="0"/>
+          <w:lang w:eastAsia="en-AE"/>
+          <w14:ligatures w14:val="none"/>
+        </w:rPr>
+        <w:t>efault subject claim prefix to use the subject-claim format containing the immutable owner ID and repository ID.</w:t>
+      </w:r>
+      <w:r>
+        <w:rPr>
+          <w:rFonts w:eastAsia="Times New Roman" w:cstheme="minorHAnsi"/>
+          <w:kern w:val="0"/>
+          <w:lang w:eastAsia="en-AE"/>
+          <w14:ligatures w14:val="none"/>
+        </w:rPr>
+        <w:t xml:space="preserve"> </w:t>
+      </w:r>
+      <w:r>
+        <w:rPr>
+          <w:rFonts w:eastAsia="Times New Roman" w:cstheme="minorHAnsi"/>
+          <w:kern w:val="0"/>
+          <w:lang w:eastAsia="en-AE"/>
+          <w14:ligatures w14:val="none"/>
+        </w:rPr>
+        <w:t>GitHub supports immutable subject claims that incorporate these IDs. They help identify the owner and repository consistently, even if their names change. The subject format used by GitHub must match the subject condition in the AWS IAM role trust policy.</w:t>
+      </w:r>
+      <w:r>
+        <w:rPr>
+          <w:rFonts w:eastAsia="Times New Roman" w:cstheme="minorHAnsi"/>
+          <w:kern w:val="0"/>
+          <w:lang w:eastAsia="en-AE"/>
+          <w14:ligatures w14:val="none"/>
+        </w:rPr>
+        <w:t xml:space="preserve"> </w:t>
+      </w:r>
+    </w:p>
+    <w:p>
+      <w:pPr>
+        <w:jc w:val="center"/>
+        <w:rPr>
+          <w:rFonts w:eastAsia="Times New Roman" w:cstheme="minorHAnsi"/>
+          <w:kern w:val="0"/>
+          <w:lang w:eastAsia="en-AE"/>
+          <w14:ligatures w14:val="none"/>
+        </w:rPr>
+      </w:pPr>
+      <w:r>
+        <w:rPr>
+          <w:rFonts w:eastAsia="Times New Roman" w:cstheme="minorHAnsi"/>
+          <w:kern w:val="0"/>
+          <w:lang w:eastAsia="en-AE"/>
+          <w14:ligatures w14:val="none"/>
+        </w:rPr>
+        <w:drawing>
+          <wp:inline distT="0" distB="0" distL="0" distR="0" wp14:anchorId="2CE27C34" wp14:editId="1BC020F0">
+            <wp:extent cx="5191125" cy="2324100"/>
+            <wp:effectExtent l="0" t="0" r="9525" b="0"/>
+            <wp:docPr id="1694671535" name="Picture 1"/>
+            <wp:cNvGraphicFramePr>
+              <a:graphicFrameLocks xmlns:a="http://schemas.openxmlformats.org/drawingml/2006/main" noChangeAspect="1"/>
+            </wp:cNvGraphicFramePr>
+            <a:graphic xmlns:a="http://schemas.openxmlformats.org/drawingml/2006/main">
+              <a:graphicData uri="http://schemas.openxmlformats.org/drawingml/2006/picture">
+                <pic:pic xmlns:pic="http://schemas.openxmlformats.org/drawingml/2006/picture">
+                  <pic:nvPicPr>
+                    <pic:cNvPr id="1694671535" name=""/>
+                    <pic:cNvPicPr/>
+                  </pic:nvPicPr>
+                  <pic:blipFill>
+                    <a:blip r:embed="rId17"/>
+                    <a:stretch>
+                      <a:fillRect/>
+                    </a:stretch>
+                  </pic:blipFill>
+                  <pic:spPr>
+                    <a:xfrm>
+                      <a:off x="0" y="0"/>
+                      <a:ext cx="5191125" cy="2324100"/>
+                    </a:xfrm>
+                    <a:prstGeom prst="rect">
+                      <a:avLst/>
+                    </a:prstGeom>
+                  </pic:spPr>
+                </pic:pic>
+              </a:graphicData>
+            </a:graphic>
+          </wp:inline>
+        </w:drawing>
+      </w:r>
+    </w:p>
+    <w:p>
+      <w:pPr>
+        <w:jc w:val="center"/>
+        <w:rPr>
+          <w:rFonts w:eastAsia="Times New Roman" w:cstheme="minorHAnsi"/>
+          <w:i/>
+          <w:iCs/>
+          <w:kern w:val="0"/>
+          <w:lang w:eastAsia="en-AE"/>
+          <w14:ligatures w14:val="none"/>
+        </w:rPr>
+      </w:pPr>
+      <w:r>
+        <w:rPr>
+          <w:rFonts w:eastAsia="Times New Roman" w:cstheme="minorHAnsi"/>
+          <w:i/>
+          <w:iCs/>
+          <w:kern w:val="0"/>
+          <w:lang w:eastAsia="en-AE"/>
+          <w14:ligatures w14:val="none"/>
+        </w:rPr>
+        <w:t xml:space="preserve">Figure 11: Default Subject Claim </w:t>
+      </w:r>
+      <w:r>
+        <w:rPr>
+          <w:rFonts w:eastAsia="Times New Roman" w:cstheme="minorHAnsi"/>
+          <w:i/>
+          <w:iCs/>
+          <w:kern w:val="0"/>
+          <w:lang w:eastAsia="en-AE"/>
+          <w14:ligatures w14:val="none"/>
+        </w:rPr>
+        <w:t>prefix</w:t>
+      </w:r>
+      <w:r>
+        <w:rPr>
+          <w:rFonts w:eastAsia="Times New Roman" w:cstheme="minorHAnsi"/>
+          <w:i/>
+          <w:iCs/>
+          <w:kern w:val="0"/>
+          <w:lang w:eastAsia="en-AE"/>
+          <w14:ligatures w14:val="none"/>
+        </w:rPr>
+        <w:t xml:space="preserve"> for the repository</w:t>
+      </w:r>
+    </w:p>
+    <w:p>
+      <w:pPr>
+        <w:jc w:val="both"/>
+        <w:rPr>
+          <w:rFonts w:eastAsia="Times New Roman" w:cstheme="minorHAnsi"/>
+          <w:kern w:val="0"/>
+          <w:lang w:eastAsia="en-AE"/>
+          <w14:ligatures w14:val="none"/>
+        </w:rPr>
+      </w:pPr>
+      <w:r>
+        <w:rPr>
+          <w:rFonts w:eastAsia="Times New Roman" w:cstheme="minorHAnsi"/>
+          <w:kern w:val="0"/>
+          <w:lang w:eastAsia="en-AE"/>
+          <w14:ligatures w14:val="none"/>
+        </w:rPr>
+        <w:t>Any</w:t>
+      </w:r>
+      <w:r>
+        <w:rPr>
+          <w:rFonts w:eastAsia="Times New Roman" w:cstheme="minorHAnsi"/>
+          <w:kern w:val="0"/>
+          <w:lang w:eastAsia="en-AE"/>
+          <w14:ligatures w14:val="none"/>
+        </w:rPr>
+        <w:t xml:space="preserve"> mismatch caus</w:t>
+      </w:r>
+      <w:r>
+        <w:rPr>
+          <w:rFonts w:eastAsia="Times New Roman" w:cstheme="minorHAnsi"/>
+          <w:kern w:val="0"/>
+          <w:lang w:eastAsia="en-AE"/>
+          <w14:ligatures w14:val="none"/>
+        </w:rPr>
+        <w:t>es</w:t>
+      </w:r>
+      <w:r>
+        <w:rPr>
+          <w:rFonts w:eastAsia="Times New Roman" w:cstheme="minorHAnsi"/>
+          <w:kern w:val="0"/>
+          <w:lang w:eastAsia="en-AE"/>
+          <w14:ligatures w14:val="none"/>
+        </w:rPr>
+        <w:t xml:space="preserve"> the OIDC role-assumption attempt to fail with the </w:t>
+      </w:r>
+      <w:r>
+        <w:rPr>
+          <w:rFonts w:eastAsia="Times New Roman" w:cstheme="minorHAnsi"/>
+          <w:b/>
+          <w:bCs/>
+          <w:kern w:val="0"/>
+          <w:lang w:eastAsia="en-AE"/>
+          <w14:ligatures w14:val="none"/>
+        </w:rPr>
+        <w:t xml:space="preserve">Not authorized to perform </w:t>
+      </w:r>
+      <w:proofErr w:type="spellStart"/>
       <w:proofErr w:type="gramStart"/>
       <w:r>
         <w:rPr>
-          <w:b/>
-          <w:bCs/>
-        </w:rPr>
-        <w:t>repo:Sandeep</w:t>
-      </w:r>
+          <w:rFonts w:eastAsia="Times New Roman" w:cstheme="minorHAnsi"/>
+          <w:b/>
+          <w:bCs/>
+          <w:kern w:val="0"/>
+          <w:lang w:eastAsia="en-AE"/>
+          <w14:ligatures w14:val="none"/>
+        </w:rPr>
+        <w:t>sts:AssumeRoleWithWebIdentity</w:t>
+      </w:r>
+      <w:proofErr w:type="spellEnd"/>
       <w:proofErr w:type="gramEnd"/>
       <w:r>
         <w:rPr>
-          <w:b/>
-          <w:bCs/>
-        </w:rPr>
-        <w:t>-Jagan@333763674/Sandeep-CICD-Project@</w:t>
-      </w:r>
-      <w:proofErr w:type="gramStart"/>
-      <w:r>
-        <w:rPr>
-          <w:b/>
-          <w:bCs/>
-        </w:rPr>
-        <w:t>1395410053:ref</w:t>
-      </w:r>
-      <w:proofErr w:type="gramEnd"/>
-      <w:r>
-        <w:rPr>
-          <w:b/>
-          <w:bCs/>
-        </w:rPr>
-        <w:t>:refs/heads/main</w:t>
+          <w:rFonts w:eastAsia="Times New Roman" w:cstheme="minorHAnsi"/>
+          <w:kern w:val="0"/>
+          <w:lang w:eastAsia="en-AE"/>
+          <w14:ligatures w14:val="none"/>
+        </w:rPr>
+        <w:t xml:space="preserve"> </w:t>
+      </w:r>
+      <w:r>
+        <w:rPr>
+          <w:rFonts w:eastAsia="Times New Roman" w:cstheme="minorHAnsi"/>
+          <w:kern w:val="0"/>
+          <w:lang w:eastAsia="en-AE"/>
+          <w14:ligatures w14:val="none"/>
+        </w:rPr>
+        <w:t>error</w:t>
+      </w:r>
+      <w:r>
+        <w:rPr>
+          <w:rFonts w:eastAsia="Times New Roman" w:cstheme="minorHAnsi"/>
+          <w:kern w:val="0"/>
+          <w:lang w:eastAsia="en-AE"/>
+          <w14:ligatures w14:val="none"/>
+        </w:rPr>
+        <w:t>.</w:t>
       </w:r>
     </w:p>
     <w:p>
@@ -5936,7 +6550,6 @@
           <w:bCs/>
           <w:noProof/>
         </w:rPr>
-        <w:lastRenderedPageBreak/>
         <w:drawing>
           <wp:inline distT="0" distB="0" distL="0" distR="0" wp14:anchorId="60CBE13A" wp14:editId="0592D41D">
             <wp:extent cx="5731510" cy="2015490"/>
@@ -5953,7 +6566,7 @@
                     <pic:cNvPicPr/>
                   </pic:nvPicPr>
                   <pic:blipFill>
-                    <a:blip r:embed="rId16"/>
+                    <a:blip r:embed="rId18"/>
                     <a:stretch>
                       <a:fillRect/>
                     </a:stretch>
@@ -5978,7 +6591,128 @@
           <w:i/>
           <w:iCs/>
         </w:rPr>
-        <w:t>Figure 11: GitHub Actions log showing successful AWS identity verification.</w:t>
+        <w:t>Figure 1</w:t>
+      </w:r>
+      <w:r>
+        <w:rPr>
+          <w:i/>
+          <w:iCs/>
+        </w:rPr>
+        <w:t>2</w:t>
+      </w:r>
+      <w:r>
+        <w:rPr>
+          <w:i/>
+          <w:iCs/>
+        </w:rPr>
+        <w:t>: GitHub Actions log showing successful AWS identity verification.</w:t>
+      </w:r>
+    </w:p>
+    <w:p>
+      <w:pPr>
+        <w:rPr>
+          <w:b/>
+          <w:bCs/>
+        </w:rPr>
+      </w:pPr>
+      <w:r>
+        <w:rPr>
+          <w:b/>
+          <w:bCs/>
+        </w:rPr>
+        <w:t>12.</w:t>
+      </w:r>
+      <w:r>
+        <w:rPr>
+          <w:b/>
+          <w:bCs/>
+        </w:rPr>
+        <w:t>5</w:t>
+      </w:r>
+      <w:r>
+        <w:rPr>
+          <w:b/>
+          <w:bCs/>
+        </w:rPr>
+        <w:t xml:space="preserve"> OIDC Authentication Flow</w:t>
+      </w:r>
+    </w:p>
+    <w:p>
+      <w:pPr>
+        <w:numPr>
+          <w:ilvl w:val="0"/>
+          <w:numId w:val="17"/>
+        </w:numPr>
+      </w:pPr>
+      <w:r>
+        <w:t>A workflow run starts in GitHub Actions.</w:t>
+      </w:r>
+    </w:p>
+    <w:p>
+      <w:pPr>
+        <w:numPr>
+          <w:ilvl w:val="0"/>
+          <w:numId w:val="17"/>
+        </w:numPr>
+      </w:pPr>
+      <w:r>
+        <w:t>The workflow has id-token: write permission.</w:t>
+      </w:r>
+    </w:p>
+    <w:p>
+      <w:pPr>
+        <w:numPr>
+          <w:ilvl w:val="0"/>
+          <w:numId w:val="17"/>
+        </w:numPr>
+      </w:pPr>
+      <w:r>
+        <w:t>GitHub issues an OIDC token for the workflow.</w:t>
+      </w:r>
+    </w:p>
+    <w:p>
+      <w:pPr>
+        <w:numPr>
+          <w:ilvl w:val="0"/>
+          <w:numId w:val="17"/>
+        </w:numPr>
+      </w:pPr>
+      <w:r>
+        <w:t>The AWS credentials action sends a role-assumption request to AWS STS.</w:t>
+      </w:r>
+    </w:p>
+    <w:p>
+      <w:pPr>
+        <w:numPr>
+          <w:ilvl w:val="0"/>
+          <w:numId w:val="17"/>
+        </w:numPr>
+      </w:pPr>
+      <w:r>
+        <w:t>AWS validates the token and evaluates the role trust policy.</w:t>
+      </w:r>
+    </w:p>
+    <w:p>
+      <w:pPr>
+        <w:numPr>
+          <w:ilvl w:val="0"/>
+          <w:numId w:val="17"/>
+        </w:numPr>
+      </w:pPr>
+      <w:r>
+        <w:lastRenderedPageBreak/>
+        <w:t>AWS STS returns temporary credentials if the request is authorized.</w:t>
+      </w:r>
+    </w:p>
+    <w:p>
+      <w:pPr>
+        <w:numPr>
+          <w:ilvl w:val="0"/>
+          <w:numId w:val="17"/>
+        </w:numPr>
+      </w:pPr>
+      <w:r>
+        <w:t>The AWS CLI uses the temporary credentials to verify the identity and deploy the files.</w:t>
       </w:r>
     </w:p>
     <w:p>
@@ -6389,7 +7123,6 @@
           <w:b/>
           <w:bCs/>
         </w:rPr>
-        <w:lastRenderedPageBreak/>
         <w:t>13.4 Deployment Verification</w:t>
       </w:r>
     </w:p>
@@ -6493,6 +7226,7 @@
         </w:numPr>
       </w:pPr>
       <w:r>
+        <w:lastRenderedPageBreak/>
         <w:t>Check the GitHub Actions deployment step for successful completion.</w:t>
       </w:r>
     </w:p>
@@ -6572,7 +7306,7 @@
                     <pic:cNvPicPr/>
                   </pic:nvPicPr>
                   <pic:blipFill>
-                    <a:blip r:embed="rId17"/>
+                    <a:blip r:embed="rId19"/>
                     <a:stretch>
                       <a:fillRect/>
                     </a:stretch>
@@ -6597,7 +7331,21 @@
           <w:i/>
           <w:iCs/>
         </w:rPr>
-        <w:t>Figure 12: S3 bucket showing the deployed application files.</w:t>
+        <w:t>Figure 1</w:t>
+      </w:r>
+      <w:r>
+        <w:rPr>
+          <w:i/>
+          <w:iCs/>
+        </w:rPr>
+        <w:t>3</w:t>
+      </w:r>
+      <w:r>
+        <w:rPr>
+          <w:i/>
+          <w:iCs/>
+        </w:rPr>
+        <w:t>: S3 bucket showing the deployed application files.</w:t>
       </w:r>
     </w:p>
     <w:p>
@@ -6651,111 +7399,128 @@
           <w:i/>
           <w:iCs/>
         </w:rPr>
-        <w:t>Figure 13: Application accessed through its configured website endpoint</w:t>
-      </w:r>
-    </w:p>
-    <w:p>
-      <w:pPr>
-        <w:rPr>
-          <w:b/>
-          <w:bCs/>
-        </w:rPr>
-      </w:pPr>
-    </w:p>
-    <w:p>
-      <w:pPr>
-        <w:rPr>
-          <w:b/>
-          <w:bCs/>
-        </w:rPr>
-      </w:pPr>
-    </w:p>
-    <w:p>
-      <w:pPr>
-        <w:rPr>
-          <w:b/>
-          <w:bCs/>
-        </w:rPr>
-      </w:pPr>
-      <w:r>
-        <w:rPr>
-          <w:b/>
-          <w:bCs/>
-        </w:rPr>
+        <w:t>Figure 1</w:t>
+      </w:r>
+      <w:r>
+        <w:rPr>
+          <w:i/>
+          <w:iCs/>
+        </w:rPr>
+        <w:t>4</w:t>
+      </w:r>
+      <w:r>
+        <w:rPr>
+          <w:i/>
+          <w:iCs/>
+        </w:rPr>
+        <w:t>: Application accessed through its configured website endpoint</w:t>
+      </w:r>
+    </w:p>
+    <w:p>
+      <w:pPr>
+        <w:rPr>
+          <w:b/>
+          <w:bCs/>
+        </w:rPr>
+      </w:pPr>
+    </w:p>
+    <w:p>
+      <w:pPr>
+        <w:rPr>
+          <w:b/>
+          <w:bCs/>
+        </w:rPr>
+      </w:pPr>
+    </w:p>
+    <w:p>
+      <w:pPr>
+        <w:rPr>
+          <w:b/>
+          <w:bCs/>
+        </w:rPr>
+      </w:pPr>
+      <w:r>
+        <w:rPr>
+          <w:b/>
+          <w:bCs/>
+        </w:rPr>
+        <w:t>1</w:t>
+      </w:r>
+      <w:r>
+        <w:rPr>
+          <w:b/>
+          <w:bCs/>
+        </w:rPr>
+        <w:t>4</w:t>
+      </w:r>
+      <w:r>
+        <w:rPr>
+          <w:b/>
+          <w:bCs/>
+        </w:rPr>
+        <w:t>. Testing and Validation</w:t>
+      </w:r>
+    </w:p>
+    <w:p>
+      <w:pPr>
+        <w:rPr>
+          <w:b/>
+          <w:bCs/>
+        </w:rPr>
+      </w:pPr>
+      <w:r>
+        <w:rPr>
+          <w:b/>
+          <w:bCs/>
+        </w:rPr>
+        <w:t>15.1 Automated Tests</w:t>
+      </w:r>
+    </w:p>
+    <w:p>
+      <w:pPr>
+        <w:rPr>
+          <w:b/>
+          <w:bCs/>
+        </w:rPr>
+      </w:pPr>
+      <w:r>
+        <w:rPr>
+          <w:b/>
+          <w:bCs/>
+        </w:rPr>
+        <w:t>The workflow executes:</w:t>
+      </w:r>
+      <w:r>
+        <w:rPr>
+          <w:b/>
+          <w:bCs/>
+        </w:rPr>
+        <w:t xml:space="preserve"> </w:t>
+      </w:r>
+      <w:r>
+        <w:rPr>
+          <w:b/>
+          <w:bCs/>
+        </w:rPr>
+        <w:t>bash tests/test.sh</w:t>
+      </w:r>
+    </w:p>
+    <w:p>
+      <w:pPr>
+        <w:jc w:val="both"/>
+      </w:pPr>
+      <w:r>
+        <w:t>The test script performs the checks implemented in the project. The exact test coverage should be described according to the contents of the committed script.</w:t>
+      </w:r>
+      <w:r>
+        <w:t xml:space="preserve"> </w:t>
+      </w:r>
+      <w:r>
+        <w:t xml:space="preserve">If the script checks </w:t>
+      </w:r>
+      <w:r>
         <w:lastRenderedPageBreak/>
-        <w:t>1</w:t>
-      </w:r>
-      <w:r>
-        <w:rPr>
-          <w:b/>
-          <w:bCs/>
-        </w:rPr>
-        <w:t>4</w:t>
-      </w:r>
-      <w:r>
-        <w:rPr>
-          <w:b/>
-          <w:bCs/>
-        </w:rPr>
-        <w:t>. Testing and Validation</w:t>
-      </w:r>
-    </w:p>
-    <w:p>
-      <w:pPr>
-        <w:rPr>
-          <w:b/>
-          <w:bCs/>
-        </w:rPr>
-      </w:pPr>
-      <w:r>
-        <w:rPr>
-          <w:b/>
-          <w:bCs/>
-        </w:rPr>
-        <w:t>15.1 Automated Tests</w:t>
-      </w:r>
-    </w:p>
-    <w:p>
-      <w:pPr>
-        <w:rPr>
-          <w:b/>
-          <w:bCs/>
-        </w:rPr>
-      </w:pPr>
-      <w:r>
-        <w:rPr>
-          <w:b/>
-          <w:bCs/>
-        </w:rPr>
-        <w:t>The workflow executes:</w:t>
-      </w:r>
-      <w:r>
-        <w:rPr>
-          <w:b/>
-          <w:bCs/>
-        </w:rPr>
-        <w:t xml:space="preserve"> </w:t>
-      </w:r>
-      <w:r>
-        <w:rPr>
-          <w:b/>
-          <w:bCs/>
-        </w:rPr>
-        <w:t>bash tests/test.sh</w:t>
-      </w:r>
-    </w:p>
-    <w:p>
-      <w:pPr>
-        <w:jc w:val="both"/>
-      </w:pPr>
-      <w:r>
-        <w:t>The test script performs the checks implemented in the project. The exact test coverage should be described according to the contents of the committed script.</w:t>
-      </w:r>
-      <w:r>
-        <w:t xml:space="preserve"> </w:t>
-      </w:r>
-      <w:r>
-        <w:t>If the script checks only file existence and basic content, it should be described as basic validation rather than a comprehensive unit test suite.</w:t>
+        <w:t>only file existence and basic content, it should be described as basic validation rather than a comprehensive unit test suite.</w:t>
       </w:r>
     </w:p>
     <w:p>
@@ -7256,15 +8021,21 @@
       </w:pPr>
       <w:r>
         <w:rPr>
+          <w:i/>
+          <w:iCs/>
+        </w:rPr>
+        <w:br/>
+      </w:r>
+      <w:r>
+        <w:rPr>
           <w:b/>
           <w:bCs/>
           <w:noProof/>
         </w:rPr>
-        <w:lastRenderedPageBreak/>
         <w:drawing>
-          <wp:inline distT="0" distB="0" distL="0" distR="0" wp14:anchorId="0E56AB04" wp14:editId="019E328E">
-            <wp:extent cx="5731510" cy="2743200"/>
-            <wp:effectExtent l="0" t="0" r="2540" b="0"/>
+          <wp:inline distT="0" distB="0" distL="0" distR="0" wp14:anchorId="0E56AB04" wp14:editId="5A0A7D50">
+            <wp:extent cx="5731510" cy="2581275"/>
+            <wp:effectExtent l="0" t="0" r="2540" b="9525"/>
             <wp:docPr id="966077973" name="Picture 1"/>
             <wp:cNvGraphicFramePr>
               <a:graphicFrameLocks xmlns:a="http://schemas.openxmlformats.org/drawingml/2006/main" noChangeAspect="1"/>
@@ -7285,7 +8056,7 @@
                   <pic:spPr>
                     <a:xfrm>
                       <a:off x="0" y="0"/>
-                      <a:ext cx="5731510" cy="2743200"/>
+                      <a:ext cx="5731510" cy="2581275"/>
                     </a:xfrm>
                     <a:prstGeom prst="rect">
                       <a:avLst/>
@@ -7302,21 +8073,36 @@
           <w:i/>
           <w:iCs/>
         </w:rPr>
-        <w:t>Figure 16: GitHub Actions showing successful file validation, tests, and build preparation.</w:t>
-      </w:r>
-    </w:p>
-    <w:p>
-      <w:pPr>
-        <w:rPr>
-          <w:b/>
-          <w:bCs/>
-        </w:rPr>
-      </w:pPr>
-      <w:r>
-        <w:rPr>
-          <w:b/>
-          <w:bCs/>
-        </w:rPr>
+        <w:t>Figure 1</w:t>
+      </w:r>
+      <w:r>
+        <w:rPr>
+          <w:i/>
+          <w:iCs/>
+        </w:rPr>
+        <w:t>5</w:t>
+      </w:r>
+      <w:r>
+        <w:rPr>
+          <w:i/>
+          <w:iCs/>
+        </w:rPr>
+        <w:t>: GitHub Actions showing successful file validation, tests, and build preparation.</w:t>
+      </w:r>
+    </w:p>
+    <w:p>
+      <w:pPr>
+        <w:rPr>
+          <w:b/>
+          <w:bCs/>
+        </w:rPr>
+      </w:pPr>
+      <w:r>
+        <w:rPr>
+          <w:b/>
+          <w:bCs/>
+        </w:rPr>
+        <w:lastRenderedPageBreak/>
         <w:t>16. Troubleshooting and Issues Resolved</w:t>
       </w:r>
     </w:p>
@@ -7369,150 +8155,86 @@
       <w:r>
         <w:t xml:space="preserve"> "</w:t>
       </w:r>
-    </w:p>
-    <w:p>
+      <w:r>
+        <w:t xml:space="preserve"> - </w:t>
+      </w:r>
       <w:r>
         <w:t>The bucket name contained an unwanted trailing space.</w:t>
       </w:r>
     </w:p>
     <w:p>
-      <w:r>
-        <w:t>The correct value was:</w:t>
+      <w:pPr>
+        <w:jc w:val="both"/>
+      </w:pPr>
+      <w:r>
+        <w:t>Resolution</w:t>
+      </w:r>
+      <w:r>
+        <w:t xml:space="preserve"> - </w:t>
+      </w:r>
+      <w:r>
+        <w:t>The repository variable was corrected to contain the exact bucket name.</w:t>
       </w:r>
       <w:r>
         <w:t xml:space="preserve"> </w:t>
       </w:r>
-      <w:proofErr w:type="spellStart"/>
-      <w:r>
-        <w:t>githubactions</w:t>
-      </w:r>
-      <w:proofErr w:type="spellEnd"/>
-      <w:r>
-        <w:t>-</w:t>
-      </w:r>
-      <w:proofErr w:type="spellStart"/>
-      <w:r>
-        <w:t>cicd</w:t>
-      </w:r>
-      <w:proofErr w:type="spellEnd"/>
-      <w:r>
-        <w:t>-demo-</w:t>
-      </w:r>
-      <w:proofErr w:type="spellStart"/>
-      <w:r>
-        <w:t>sandeep</w:t>
-      </w:r>
-      <w:proofErr w:type="spellEnd"/>
+      <w:r>
+        <w:t>After the correction, the workflow proceeded through AWS authentication and S3 deployment successfully.</w:t>
+      </w:r>
+    </w:p>
+    <w:p>
+      <w:pPr>
+        <w:rPr>
+          <w:b/>
+          <w:bCs/>
+        </w:rPr>
+      </w:pPr>
+      <w:r>
+        <w:rPr>
+          <w:b/>
+          <w:bCs/>
+        </w:rPr>
+        <w:t>16.2 OIDC Trust Policy Validation</w:t>
+      </w:r>
     </w:p>
     <w:p>
       <w:pPr>
         <w:jc w:val="both"/>
       </w:pPr>
       <w:r>
-        <w:t>Root Cause</w:t>
-      </w:r>
-      <w:r>
-        <w:t xml:space="preserve"> - </w:t>
-      </w:r>
-      <w:r>
-        <w:t>The S3_BUCKET GitHub repository variable did not exactly match the S3 bucket name because of trailing whitespace.</w:t>
-      </w:r>
-    </w:p>
-    <w:p>
-      <w:pPr>
-        <w:jc w:val="both"/>
-      </w:pPr>
-      <w:r>
-        <w:t>Resolution</w:t>
-      </w:r>
-      <w:r>
-        <w:t xml:space="preserve"> - </w:t>
-      </w:r>
-      <w:r>
-        <w:t>The repository variable was corrected to contain the exact bucket name.</w:t>
+        <w:t>The workflow's OIDC claims were inspected during troubleshooting.</w:t>
       </w:r>
       <w:r>
         <w:t xml:space="preserve"> </w:t>
       </w:r>
       <w:r>
-        <w:t>After the correction, the workflow proceeded through AWS authentication and S3 deployment successfully.</w:t>
-      </w:r>
-    </w:p>
-    <w:p>
-      <w:pPr>
-        <w:jc w:val="both"/>
-      </w:pPr>
-      <w:r>
-        <w:t>Lesson Learned</w:t>
-      </w:r>
-      <w:r>
-        <w:t xml:space="preserve"> - </w:t>
-      </w:r>
-      <w:r>
-        <w:t>Repository variables must be checked carefully for leading or trailing spaces. Configuration values should be validated before running AWS commands.</w:t>
-      </w:r>
-    </w:p>
-    <w:p>
-      <w:pPr>
-        <w:rPr>
-          <w:b/>
-          <w:bCs/>
-        </w:rPr>
-      </w:pPr>
-      <w:r>
-        <w:rPr>
-          <w:b/>
-          <w:bCs/>
-        </w:rPr>
-        <w:t>16.2 OIDC Trust Policy Validation</w:t>
-      </w:r>
-    </w:p>
-    <w:p>
-      <w:r>
-        <w:t>The workflow's OIDC claims were inspected during troubleshooting.</w:t>
+        <w:t>The issuer and audience were as expected, but the reported subject format differed from the common repository subject example.</w:t>
       </w:r>
       <w:r>
         <w:t xml:space="preserve"> </w:t>
       </w:r>
       <w:r>
-        <w:t>The issuer and audience were as expected, but the reported subject format differed from the common repository subject example.</w:t>
+        <w:t>The IAM role trust policy must therefore be checked directly to ensure it matches the actual workflow identity and is restricted to the intended repository and branch.</w:t>
       </w:r>
       <w:r>
         <w:t xml:space="preserve"> </w:t>
       </w:r>
       <w:r>
-        <w:t>The IAM role trust policy must therefore be checked directly to ensure it matches the actual workflow identity and is restricted to the intended repository and branch.</w:t>
-      </w:r>
-      <w:r>
-        <w:t xml:space="preserve"> </w:t>
-      </w:r>
-      <w:r>
         <w:t>Do not broaden the trust policy unnecessarily to resolve an authentication error.</w:t>
       </w:r>
     </w:p>
     <w:p>
       <w:pPr>
-        <w:jc w:val="both"/>
-      </w:pPr>
-    </w:p>
-    <w:p>
-      <w:pPr>
-        <w:jc w:val="both"/>
-      </w:pPr>
-    </w:p>
-    <w:p>
-      <w:pPr>
-        <w:rPr>
-          <w:b/>
-          <w:bCs/>
-        </w:rPr>
-      </w:pPr>
-      <w:r>
-        <w:rPr>
-          <w:b/>
-          <w:bCs/>
-        </w:rPr>
-        <w:lastRenderedPageBreak/>
+        <w:rPr>
+          <w:b/>
+          <w:bCs/>
+        </w:rPr>
+      </w:pPr>
+      <w:r>
+        <w:rPr>
+          <w:b/>
+          <w:bCs/>
+        </w:rPr>
         <w:t>Resolution and Verification</w:t>
       </w:r>
     </w:p>
@@ -7768,7 +8490,21 @@
           <w:b/>
           <w:bCs/>
         </w:rPr>
-        <w:t>.4 Protect Private SSH Keys</w:t>
+        <w:t>.</w:t>
+      </w:r>
+      <w:r>
+        <w:rPr>
+          <w:b/>
+          <w:bCs/>
+        </w:rPr>
+        <w:t>4</w:t>
+      </w:r>
+      <w:r>
+        <w:rPr>
+          <w:b/>
+          <w:bCs/>
+        </w:rPr>
+        <w:t xml:space="preserve"> Protect the S3 Destination</w:t>
       </w:r>
       <w:r>
         <w:rPr>
@@ -7778,21 +8514,13 @@
         <w:t xml:space="preserve"> - </w:t>
       </w:r>
       <w:r>
-        <w:t xml:space="preserve">Keep the </w:t>
-      </w:r>
-      <w:proofErr w:type="spellStart"/>
-      <w:r>
-        <w:t>CodeCommit</w:t>
-      </w:r>
-      <w:proofErr w:type="spellEnd"/>
-      <w:r>
-        <w:t xml:space="preserve"> private key on the authorized machine.</w:t>
+        <w:t>The --delete option can remove objects that are not present in the local deployment directory.</w:t>
       </w:r>
       <w:r>
         <w:t xml:space="preserve"> </w:t>
       </w:r>
       <w:r>
-        <w:t>Never commit it to GitHub or include it in documentation.</w:t>
+        <w:t>Use a dedicated bucket or safe deployment prefix and ensure the IAM role is scoped accordingly.</w:t>
       </w:r>
     </w:p>
     <w:p>
@@ -7808,6 +8536,7 @@
           <w:b/>
           <w:bCs/>
         </w:rPr>
+        <w:lastRenderedPageBreak/>
         <w:t>1</w:t>
       </w:r>
       <w:r>
@@ -7822,7 +8551,21 @@
           <w:b/>
           <w:bCs/>
         </w:rPr>
-        <w:t>.5 Protect the S3 Destination</w:t>
+        <w:t>.</w:t>
+      </w:r>
+      <w:r>
+        <w:rPr>
+          <w:b/>
+          <w:bCs/>
+        </w:rPr>
+        <w:t>5</w:t>
+      </w:r>
+      <w:r>
+        <w:rPr>
+          <w:b/>
+          <w:bCs/>
+        </w:rPr>
+        <w:t xml:space="preserve"> Protect Workflow Configuration</w:t>
       </w:r>
       <w:r>
         <w:rPr>
@@ -7832,13 +8575,7 @@
         <w:t xml:space="preserve"> - </w:t>
       </w:r>
       <w:r>
-        <w:t>The --delete option can remove objects that are not present in the local deployment directory.</w:t>
-      </w:r>
-      <w:r>
-        <w:t xml:space="preserve"> </w:t>
-      </w:r>
-      <w:r>
-        <w:t>Use a dedicated bucket or safe deployment prefix and ensure the IAM role is scoped accordingly.</w:t>
+        <w:t>Review workflow changes, keep permissions minimal, and consider pinning third-party actions to verified full commit SHAs according to organizational policy.</w:t>
       </w:r>
     </w:p>
     <w:p>
@@ -7868,33 +8605,7 @@
           <w:b/>
           <w:bCs/>
         </w:rPr>
-        <w:t>.6 Protect Workflow Configuration</w:t>
-      </w:r>
-      <w:r>
-        <w:rPr>
-          <w:b/>
-          <w:bCs/>
-        </w:rPr>
-        <w:t xml:space="preserve"> - </w:t>
-      </w:r>
-      <w:r>
-        <w:t>Review workflow changes, keep permissions minimal, and consider pinning third-party actions to verified full commit SHAs according to organizational policy.</w:t>
-      </w:r>
-    </w:p>
-    <w:p>
-      <w:pPr>
-        <w:jc w:val="both"/>
-        <w:rPr>
-          <w:b/>
-          <w:bCs/>
-        </w:rPr>
-      </w:pPr>
-      <w:r>
-        <w:rPr>
-          <w:b/>
-          <w:bCs/>
-        </w:rPr>
-        <w:t>1</w:t>
+        <w:t>.</w:t>
       </w:r>
       <w:r>
         <w:rPr>
@@ -7908,7 +8619,7 @@
           <w:b/>
           <w:bCs/>
         </w:rPr>
-        <w:t xml:space="preserve">.7 Review </w:t>
+        <w:t xml:space="preserve"> Review </w:t>
       </w:r>
       <w:r>
         <w:rPr>
@@ -7937,8 +8648,8 @@
     </w:p>
     <w:p/>
     <w:sectPr>
-      <w:headerReference w:type="default" r:id="rId18"/>
-      <w:footerReference w:type="default" r:id="rId19"/>
+      <w:headerReference w:type="default" r:id="rId20"/>
+      <w:footerReference w:type="default" r:id="rId21"/>
       <w:pgSz w:w="11906" w:h="16838"/>
       <w:pgMar w:top="1440" w:right="1440" w:bottom="1440" w:left="1440" w:header="720" w:footer="720" w:gutter="0"/>
       <w:cols w:space="720"/>
@@ -12020,6 +12731,268 @@
     </w:lvl>
   </w:abstractNum>
   <w:abstractNum w:abstractNumId="31" w15:restartNumberingAfterBreak="0">
+    <w:nsid w:val="65A95BCB"/>
+    <w:multiLevelType w:val="multilevel"/>
+    <w:tmpl w:val="930A9080"/>
+    <w:lvl w:ilvl="0">
+      <w:start w:val="1"/>
+      <w:numFmt w:val="decimal"/>
+      <w:lvlText w:val="%1."/>
+      <w:lvlJc w:val="left"/>
+      <w:pPr>
+        <w:tabs>
+          <w:tab w:val="num" w:pos="720"/>
+        </w:tabs>
+        <w:ind w:left="720" w:hanging="360"/>
+      </w:pPr>
+    </w:lvl>
+    <w:lvl w:ilvl="1" w:tentative="1">
+      <w:start w:val="1"/>
+      <w:numFmt w:val="decimal"/>
+      <w:lvlText w:val="%2."/>
+      <w:lvlJc w:val="left"/>
+      <w:pPr>
+        <w:tabs>
+          <w:tab w:val="num" w:pos="1440"/>
+        </w:tabs>
+        <w:ind w:left="1440" w:hanging="360"/>
+      </w:pPr>
+    </w:lvl>
+    <w:lvl w:ilvl="2" w:tentative="1">
+      <w:start w:val="1"/>
+      <w:numFmt w:val="decimal"/>
+      <w:lvlText w:val="%3."/>
+      <w:lvlJc w:val="left"/>
+      <w:pPr>
+        <w:tabs>
+          <w:tab w:val="num" w:pos="2160"/>
+        </w:tabs>
+        <w:ind w:left="2160" w:hanging="360"/>
+      </w:pPr>
+    </w:lvl>
+    <w:lvl w:ilvl="3" w:tentative="1">
+      <w:start w:val="1"/>
+      <w:numFmt w:val="decimal"/>
+      <w:lvlText w:val="%4."/>
+      <w:lvlJc w:val="left"/>
+      <w:pPr>
+        <w:tabs>
+          <w:tab w:val="num" w:pos="2880"/>
+        </w:tabs>
+        <w:ind w:left="2880" w:hanging="360"/>
+      </w:pPr>
+    </w:lvl>
+    <w:lvl w:ilvl="4" w:tentative="1">
+      <w:start w:val="1"/>
+      <w:numFmt w:val="decimal"/>
+      <w:lvlText w:val="%5."/>
+      <w:lvlJc w:val="left"/>
+      <w:pPr>
+        <w:tabs>
+          <w:tab w:val="num" w:pos="3600"/>
+        </w:tabs>
+        <w:ind w:left="3600" w:hanging="360"/>
+      </w:pPr>
+    </w:lvl>
+    <w:lvl w:ilvl="5" w:tentative="1">
+      <w:start w:val="1"/>
+      <w:numFmt w:val="decimal"/>
+      <w:lvlText w:val="%6."/>
+      <w:lvlJc w:val="left"/>
+      <w:pPr>
+        <w:tabs>
+          <w:tab w:val="num" w:pos="4320"/>
+        </w:tabs>
+        <w:ind w:left="4320" w:hanging="360"/>
+      </w:pPr>
+    </w:lvl>
+    <w:lvl w:ilvl="6" w:tentative="1">
+      <w:start w:val="1"/>
+      <w:numFmt w:val="decimal"/>
+      <w:lvlText w:val="%7."/>
+      <w:lvlJc w:val="left"/>
+      <w:pPr>
+        <w:tabs>
+          <w:tab w:val="num" w:pos="5040"/>
+        </w:tabs>
+        <w:ind w:left="5040" w:hanging="360"/>
+      </w:pPr>
+    </w:lvl>
+    <w:lvl w:ilvl="7" w:tentative="1">
+      <w:start w:val="1"/>
+      <w:numFmt w:val="decimal"/>
+      <w:lvlText w:val="%8."/>
+      <w:lvlJc w:val="left"/>
+      <w:pPr>
+        <w:tabs>
+          <w:tab w:val="num" w:pos="5760"/>
+        </w:tabs>
+        <w:ind w:left="5760" w:hanging="360"/>
+      </w:pPr>
+    </w:lvl>
+    <w:lvl w:ilvl="8" w:tentative="1">
+      <w:start w:val="1"/>
+      <w:numFmt w:val="decimal"/>
+      <w:lvlText w:val="%9."/>
+      <w:lvlJc w:val="left"/>
+      <w:pPr>
+        <w:tabs>
+          <w:tab w:val="num" w:pos="6480"/>
+        </w:tabs>
+        <w:ind w:left="6480" w:hanging="360"/>
+      </w:pPr>
+    </w:lvl>
+  </w:abstractNum>
+  <w:abstractNum w:abstractNumId="32" w15:restartNumberingAfterBreak="0">
+    <w:nsid w:val="68775CE5"/>
+    <w:multiLevelType w:val="multilevel"/>
+    <w:tmpl w:val="18E09D0A"/>
+    <w:lvl w:ilvl="0">
+      <w:start w:val="1"/>
+      <w:numFmt w:val="bullet"/>
+      <w:lvlText w:val=""/>
+      <w:lvlJc w:val="left"/>
+      <w:pPr>
+        <w:tabs>
+          <w:tab w:val="num" w:pos="720"/>
+        </w:tabs>
+        <w:ind w:left="720" w:hanging="360"/>
+      </w:pPr>
+      <w:rPr>
+        <w:rFonts w:ascii="Symbol" w:hAnsi="Symbol" w:hint="default"/>
+        <w:sz w:val="20"/>
+      </w:rPr>
+    </w:lvl>
+    <w:lvl w:ilvl="1" w:tentative="1">
+      <w:start w:val="1"/>
+      <w:numFmt w:val="bullet"/>
+      <w:lvlText w:val="o"/>
+      <w:lvlJc w:val="left"/>
+      <w:pPr>
+        <w:tabs>
+          <w:tab w:val="num" w:pos="1440"/>
+        </w:tabs>
+        <w:ind w:left="1440" w:hanging="360"/>
+      </w:pPr>
+      <w:rPr>
+        <w:rFonts w:ascii="Courier New" w:hAnsi="Courier New" w:hint="default"/>
+        <w:sz w:val="20"/>
+      </w:rPr>
+    </w:lvl>
+    <w:lvl w:ilvl="2" w:tentative="1">
+      <w:start w:val="1"/>
+      <w:numFmt w:val="bullet"/>
+      <w:lvlText w:val=""/>
+      <w:lvlJc w:val="left"/>
+      <w:pPr>
+        <w:tabs>
+          <w:tab w:val="num" w:pos="2160"/>
+        </w:tabs>
+        <w:ind w:left="2160" w:hanging="360"/>
+      </w:pPr>
+      <w:rPr>
+        <w:rFonts w:ascii="Wingdings" w:hAnsi="Wingdings" w:hint="default"/>
+        <w:sz w:val="20"/>
+      </w:rPr>
+    </w:lvl>
+    <w:lvl w:ilvl="3" w:tentative="1">
+      <w:start w:val="1"/>
+      <w:numFmt w:val="bullet"/>
+      <w:lvlText w:val=""/>
+      <w:lvlJc w:val="left"/>
+      <w:pPr>
+        <w:tabs>
+          <w:tab w:val="num" w:pos="2880"/>
+        </w:tabs>
+        <w:ind w:left="2880" w:hanging="360"/>
+      </w:pPr>
+      <w:rPr>
+        <w:rFonts w:ascii="Wingdings" w:hAnsi="Wingdings" w:hint="default"/>
+        <w:sz w:val="20"/>
+      </w:rPr>
+    </w:lvl>
+    <w:lvl w:ilvl="4" w:tentative="1">
+      <w:start w:val="1"/>
+      <w:numFmt w:val="bullet"/>
+      <w:lvlText w:val=""/>
+      <w:lvlJc w:val="left"/>
+      <w:pPr>
+        <w:tabs>
+          <w:tab w:val="num" w:pos="3600"/>
+        </w:tabs>
+        <w:ind w:left="3600" w:hanging="360"/>
+      </w:pPr>
+      <w:rPr>
+        <w:rFonts w:ascii="Wingdings" w:hAnsi="Wingdings" w:hint="default"/>
+        <w:sz w:val="20"/>
+      </w:rPr>
+    </w:lvl>
+    <w:lvl w:ilvl="5" w:tentative="1">
+      <w:start w:val="1"/>
+      <w:numFmt w:val="bullet"/>
+      <w:lvlText w:val=""/>
+      <w:lvlJc w:val="left"/>
+      <w:pPr>
+        <w:tabs>
+          <w:tab w:val="num" w:pos="4320"/>
+        </w:tabs>
+        <w:ind w:left="4320" w:hanging="360"/>
+      </w:pPr>
+      <w:rPr>
+        <w:rFonts w:ascii="Wingdings" w:hAnsi="Wingdings" w:hint="default"/>
+        <w:sz w:val="20"/>
+      </w:rPr>
+    </w:lvl>
+    <w:lvl w:ilvl="6" w:tentative="1">
+      <w:start w:val="1"/>
+      <w:numFmt w:val="bullet"/>
+      <w:lvlText w:val=""/>
+      <w:lvlJc w:val="left"/>
+      <w:pPr>
+        <w:tabs>
+          <w:tab w:val="num" w:pos="5040"/>
+        </w:tabs>
+        <w:ind w:left="5040" w:hanging="360"/>
+      </w:pPr>
+      <w:rPr>
+        <w:rFonts w:ascii="Wingdings" w:hAnsi="Wingdings" w:hint="default"/>
+        <w:sz w:val="20"/>
+      </w:rPr>
+    </w:lvl>
+    <w:lvl w:ilvl="7" w:tentative="1">
+      <w:start w:val="1"/>
+      <w:numFmt w:val="bullet"/>
+      <w:lvlText w:val=""/>
+      <w:lvlJc w:val="left"/>
+      <w:pPr>
+        <w:tabs>
+          <w:tab w:val="num" w:pos="5760"/>
+        </w:tabs>
+        <w:ind w:left="5760" w:hanging="360"/>
+      </w:pPr>
+      <w:rPr>
+        <w:rFonts w:ascii="Wingdings" w:hAnsi="Wingdings" w:hint="default"/>
+        <w:sz w:val="20"/>
+      </w:rPr>
+    </w:lvl>
+    <w:lvl w:ilvl="8" w:tentative="1">
+      <w:start w:val="1"/>
+      <w:numFmt w:val="bullet"/>
+      <w:lvlText w:val=""/>
+      <w:lvlJc w:val="left"/>
+      <w:pPr>
+        <w:tabs>
+          <w:tab w:val="num" w:pos="6480"/>
+        </w:tabs>
+        <w:ind w:left="6480" w:hanging="360"/>
+      </w:pPr>
+      <w:rPr>
+        <w:rFonts w:ascii="Wingdings" w:hAnsi="Wingdings" w:hint="default"/>
+        <w:sz w:val="20"/>
+      </w:rPr>
+    </w:lvl>
+  </w:abstractNum>
+  <w:abstractNum w:abstractNumId="33" w15:restartNumberingAfterBreak="0">
     <w:nsid w:val="75157A66"/>
     <w:multiLevelType w:val="hybridMultilevel"/>
     <w:tmpl w:val="BA5273FC"/>
@@ -12132,7 +13105,7 @@
       </w:rPr>
     </w:lvl>
   </w:abstractNum>
-  <w:abstractNum w:abstractNumId="32" w15:restartNumberingAfterBreak="0">
+  <w:abstractNum w:abstractNumId="34" w15:restartNumberingAfterBreak="0">
     <w:nsid w:val="76DD3C17"/>
     <w:multiLevelType w:val="hybridMultilevel"/>
     <w:tmpl w:val="96CC868E"/>
@@ -12245,7 +13218,7 @@
       </w:rPr>
     </w:lvl>
   </w:abstractNum>
-  <w:abstractNum w:abstractNumId="33" w15:restartNumberingAfterBreak="0">
+  <w:abstractNum w:abstractNumId="35" w15:restartNumberingAfterBreak="0">
     <w:nsid w:val="77485EAE"/>
     <w:multiLevelType w:val="multilevel"/>
     <w:tmpl w:val="0C5810AA"/>
@@ -12394,7 +13367,7 @@
       </w:rPr>
     </w:lvl>
   </w:abstractNum>
-  <w:abstractNum w:abstractNumId="34" w15:restartNumberingAfterBreak="0">
+  <w:abstractNum w:abstractNumId="36" w15:restartNumberingAfterBreak="0">
     <w:nsid w:val="79A90DEC"/>
     <w:multiLevelType w:val="hybridMultilevel"/>
     <w:tmpl w:val="446067C6"/>
@@ -12507,7 +13480,7 @@
       </w:rPr>
     </w:lvl>
   </w:abstractNum>
-  <w:abstractNum w:abstractNumId="35" w15:restartNumberingAfterBreak="0">
+  <w:abstractNum w:abstractNumId="37" w15:restartNumberingAfterBreak="0">
     <w:nsid w:val="7FFE0FF1"/>
     <w:multiLevelType w:val="hybridMultilevel"/>
     <w:tmpl w:val="86E4839C"/>
@@ -12636,7 +13609,7 @@
     <w:abstractNumId w:val="29"/>
   </w:num>
   <w:num w:numId="6" w16cid:durableId="1589076204">
-    <w:abstractNumId w:val="33"/>
+    <w:abstractNumId w:val="35"/>
   </w:num>
   <w:num w:numId="7" w16cid:durableId="1218737178">
     <w:abstractNumId w:val="24"/>
@@ -12648,7 +13621,7 @@
     <w:abstractNumId w:val="7"/>
   </w:num>
   <w:num w:numId="10" w16cid:durableId="1527213227">
-    <w:abstractNumId w:val="34"/>
+    <w:abstractNumId w:val="36"/>
   </w:num>
   <w:num w:numId="11" w16cid:durableId="897672991">
     <w:abstractNumId w:val="12"/>
@@ -12696,7 +13669,7 @@
     <w:abstractNumId w:val="16"/>
   </w:num>
   <w:num w:numId="26" w16cid:durableId="1507744443">
-    <w:abstractNumId w:val="32"/>
+    <w:abstractNumId w:val="34"/>
   </w:num>
   <w:num w:numId="27" w16cid:durableId="2050491046">
     <w:abstractNumId w:val="20"/>
@@ -12705,10 +13678,10 @@
     <w:abstractNumId w:val="5"/>
   </w:num>
   <w:num w:numId="29" w16cid:durableId="5792257">
-    <w:abstractNumId w:val="35"/>
+    <w:abstractNumId w:val="37"/>
   </w:num>
   <w:num w:numId="30" w16cid:durableId="1604922033">
-    <w:abstractNumId w:val="31"/>
+    <w:abstractNumId w:val="33"/>
   </w:num>
   <w:num w:numId="31" w16cid:durableId="909774499">
     <w:abstractNumId w:val="17"/>
@@ -12727,6 +13700,12 @@
   </w:num>
   <w:num w:numId="36" w16cid:durableId="1533418936">
     <w:abstractNumId w:val="8"/>
+  </w:num>
+  <w:num w:numId="37" w16cid:durableId="223688556">
+    <w:abstractNumId w:val="32"/>
+  </w:num>
+  <w:num w:numId="38" w16cid:durableId="239290591">
+    <w:abstractNumId w:val="31"/>
   </w:num>
 </w:numbering>
 </file>
@@ -13334,6 +14313,7 @@
   <w:style w:type="character" w:default="1" w:styleId="DefaultParagraphFont">
     <w:name w:val="Default Paragraph Font"/>
     <w:uiPriority w:val="1"/>
+    <w:semiHidden/>
     <w:unhideWhenUsed/>
   </w:style>
   <w:style w:type="table" w:default="1" w:styleId="TableNormal">
@@ -14185,6 +15165,47 @@
     <w:uiPriority w:val="99"/>
     <w:rsid w:val="00BD6801"/>
   </w:style>
+  <w:style w:type="paragraph" w:styleId="NormalWeb">
+    <w:name w:val="Normal (Web)"/>
+    <w:basedOn w:val="Normal"/>
+    <w:uiPriority w:val="99"/>
+    <w:semiHidden/>
+    <w:unhideWhenUsed/>
+    <w:rsid w:val="00953CB5"/>
+    <w:pPr>
+      <w:spacing w:before="100" w:beforeAutospacing="1" w:after="100" w:afterAutospacing="1" w:line="240" w:lineRule="auto"/>
+    </w:pPr>
+    <w:rPr>
+      <w:rFonts w:ascii="Times New Roman" w:eastAsia="Times New Roman" w:hAnsi="Times New Roman" w:cs="Times New Roman"/>
+      <w:kern w:val="0"/>
+      <w:lang w:eastAsia="en-AE"/>
+      <w14:ligatures w14:val="none"/>
+    </w:rPr>
+  </w:style>
+  <w:style w:type="character" w:styleId="Strong">
+    <w:name w:val="Strong"/>
+    <w:basedOn w:val="DefaultParagraphFont"/>
+    <w:uiPriority w:val="22"/>
+    <w:qFormat/>
+    <w:rsid w:val="00953CB5"/>
+    <w:rPr>
+      <w:b/>
+      <w:bCs/>
+    </w:rPr>
+  </w:style>
+  <w:style w:type="character" w:styleId="HTMLCode">
+    <w:name w:val="HTML Code"/>
+    <w:basedOn w:val="DefaultParagraphFont"/>
+    <w:uiPriority w:val="99"/>
+    <w:semiHidden/>
+    <w:unhideWhenUsed/>
+    <w:rsid w:val="00953CB5"/>
+    <w:rPr>
+      <w:rFonts w:ascii="Courier New" w:eastAsia="Times New Roman" w:hAnsi="Courier New" w:cs="Courier New"/>
+      <w:sz w:val="20"/>
+      <w:szCs w:val="20"/>
+    </w:rPr>
+  </w:style>
 </w:styles>
 </file>
 

</xml_diff>